<commit_message>
feat: add threshold utility operating-point analysis
</commit_message>
<xml_diff>
--- a/docs/manuscript/v0.2_2026-04-09/manuscript_consistency_report_v0.2_2026-04-09.docx
+++ b/docs/manuscript/v0.2_2026-04-09/manuscript_consistency_report_v0.2_2026-04-09.docx
@@ -36,7 +36,7 @@
         <w:t xml:space="preserve"> </w:t>
       </w:r>
       <w:r>
-        <w:t xml:space="preserve">(5/5)</w:t>
+        <w:t xml:space="preserve">(6/6)</w:t>
       </w:r>
     </w:p>
     <w:p>
@@ -428,6 +428,41 @@
               <w:jc w:val="left"/>
             </w:pPr>
             <w:r>
+              <w:t xml:space="preserve">Threshold utility assets exist</w:t>
+            </w:r>
+          </w:p>
+        </w:tc>
+        <w:tc>
+          <w:p>
+            <w:pPr>
+              <w:pStyle w:val="Compact"/>
+              <w:jc w:val="left"/>
+            </w:pPr>
+            <w:r>
+              <w:t xml:space="preserve">PASS</w:t>
+            </w:r>
+          </w:p>
+        </w:tc>
+        <w:tc>
+          <w:p>
+            <w:pPr>
+              <w:pStyle w:val="Compact"/>
+              <w:jc w:val="left"/>
+            </w:pPr>
+            <w:r>
+              <w:t xml:space="preserve">figure_4 + threshold utility csv artifacts present</w:t>
+            </w:r>
+          </w:p>
+        </w:tc>
+      </w:tr>
+      <w:tr>
+        <w:tc>
+          <w:p>
+            <w:pPr>
+              <w:pStyle w:val="Compact"/>
+              <w:jc w:val="left"/>
+            </w:pPr>
+            <w:r>
               <w:t xml:space="preserve">Core quantitative tables exist</w:t>
             </w:r>
           </w:p>
@@ -450,7 +485,7 @@
               <w:jc w:val="left"/>
             </w:pPr>
             <w:r>
-              <w:t xml:space="preserve">recommended/transfer/uncertainty/ablation csv files present</w:t>
+              <w:t xml:space="preserve">recommended/transfer/significance/ablation/utility csv files present</w:t>
             </w:r>
           </w:p>
         </w:tc>

</xml_diff>

<commit_message>
Add out-of-domain validation appendix and bundle artifacts
</commit_message>
<xml_diff>
--- a/docs/manuscript/v0.2_2026-04-09/manuscript_consistency_report_v0.2_2026-04-09.docx
+++ b/docs/manuscript/v0.2_2026-04-09/manuscript_consistency_report_v0.2_2026-04-09.docx
@@ -534,6 +534,39 @@
       </w:pPr>
       <w:r>
         <w:t xml:space="preserve">Seattle transfer routes include zero in CI, so the claim is limited to near-neutral/weak-positive behavior.</w:t>
+      </w:r>
+    </w:p>
+    <w:p>
+      <w:pPr>
+        <w:numPr>
+          <w:ilvl w:val="0"/>
+          <w:numId w:val="1002"/>
+        </w:numPr>
+        <w:pStyle w:val="Compact"/>
+      </w:pPr>
+      <w:r>
+        <w:t xml:space="preserve">Out-of-domain expansion artifacts are attached (</w:t>
+      </w:r>
+      <w:r>
+        <w:rPr>
+          <w:rStyle w:val="VerbatimChar"/>
+        </w:rPr>
+        <w:t xml:space="preserve">out_of_domain_validation_detail_summary.csv</w:t>
+      </w:r>
+      <w:r>
+        <w:t xml:space="preserve">,</w:t>
+      </w:r>
+      <w:r>
+        <w:t xml:space="preserve"> </w:t>
+      </w:r>
+      <w:r>
+        <w:rPr>
+          <w:rStyle w:val="VerbatimChar"/>
+        </w:rPr>
+        <w:t xml:space="preserve">out_of_domain_validation_summary.csv</w:t>
+      </w:r>
+      <w:r>
+        <w:t xml:space="preserve">).</w:t>
       </w:r>
     </w:p>
     <w:bookmarkEnd w:id="20"/>

</xml_diff>